<commit_message>
Survey 1: funding statement naming Amrita Vishwa Vidyapeetham; corresponding author left open
</commit_message>
<xml_diff>
--- a/github/k/Survey1_ACM_CSUR_Supplementary_Material.docx
+++ b/github/k/Survey1_ACM_CSUR_Supplementary_Material.docx
@@ -9902,22 +9902,7 @@
               <w:jc w:val="left"/>
             </w:pPr>
             <w:r>
-              <w:t xml:space="preserve">[funding statement, or</w:t>
-            </w:r>
-            <w:r>
-              <w:t xml:space="preserve"> </w:t>
-            </w:r>
-            <w:r>
-              <w:t xml:space="preserve">“</w:t>
-            </w:r>
-            <w:r>
-              <w:t xml:space="preserve">none</w:t>
-            </w:r>
-            <w:r>
-              <w:t xml:space="preserve">”</w:t>
-            </w:r>
-            <w:r>
-              <w:t xml:space="preserve">]</w:t>
+              <w:t xml:space="preserve">This research received no external funding. It was carried out as part of the authors’ work at Amrita Vishwa Vidyapeetham, Chennai, India.</w:t>
             </w:r>
           </w:p>
         </w:tc>

</xml_diff>

<commit_message>
Survey 1: complete PRISMA checklist wording (items 6, 8, 16a/b, 20, 27); data as supplementary material
- Data Availability: placeholder DOI removed; data provided as
  supplementary material (CSV extraction and appraisal tables).
- Checklist: search dates (6), screener (8), excluded look-alike studies
  (16b), updated table references (20), full availability list (27).
</commit_message>
<xml_diff>
--- a/github/k/Survey1_ACM_CSUR_Supplementary_Material.docx
+++ b/github/k/Survey1_ACM_CSUR_Supplementary_Material.docx
@@ -9180,7 +9180,7 @@
               <w:jc w:val="left"/>
             </w:pPr>
             <w:r>
-              <w:t xml:space="preserve">Section 3.2; Table S6</w:t>
+              <w:t xml:space="preserve">Section 3.2; Table S6; all sources searched up to October 2026</w:t>
             </w:r>
           </w:p>
         </w:tc>
@@ -9256,7 +9256,7 @@
               <w:jc w:val="left"/>
             </w:pPr>
             <w:r>
-              <w:t xml:space="preserve">Section 3.4</w:t>
+              <w:t xml:space="preserve">Section 3.4; records screened by one reviewer (the first author), as stated in Section 3.5</w:t>
             </w:r>
           </w:p>
         </w:tc>
@@ -9560,7 +9560,7 @@
               <w:jc w:val="left"/>
             </w:pPr>
             <w:r>
-              <w:t xml:space="preserve">Figure S1</w:t>
+              <w:t xml:space="preserve">(a) Section 3.4, Table S2, and Figure S1. (b) Six quantum computer-vision studies that appear to meet the criteria were excluded because they have no robotic application (criterion I1); they are listed and discussed under Emerging Directions in this supplement</w:t>
             </w:r>
           </w:p>
         </w:tc>
@@ -9712,7 +9712,7 @@
               <w:jc w:val="left"/>
             </w:pPr>
             <w:r>
-              <w:t xml:space="preserve">Section 11; Tables 2 and 3</w:t>
+              <w:t xml:space="preserve">Section 11 and Tables 3–5 of the main article; Table S7</w:t>
             </w:r>
           </w:p>
         </w:tc>
@@ -9978,7 +9978,7 @@
               <w:jc w:val="left"/>
             </w:pPr>
             <w:r>
-              <w:t xml:space="preserve">Table S1 and the machine-readable evidence table</w:t>
+              <w:t xml:space="preserve">Data collection form: codebook; extracted data: Table S1 and CSV; appraisal: Table S5 and CSV; search strings: Table S6; all provided as supplementary material. No analytic code beyond the figure scripts, available on request</w:t>
             </w:r>
           </w:p>
         </w:tc>

</xml_diff>